<commit_message>
feat: v2.2.0 - dark mode styling, combobox fixes, and branch management
</commit_message>
<xml_diff>
--- a/Models/My_Attest_domiciliation.docx
+++ b/Models/My_Attest_domiciliation.docx
@@ -5,7 +5,6 @@
     <w:p>
       <w:pPr>
         <w:spacing w:after="0" w:line="240" w:lineRule="auto"/>
-        <w:jc w:val="center"/>
         <w:rPr>
           <w:rFonts w:ascii="Times New Roman" w:hAnsi="Times New Roman"/>
           <w:b/>
@@ -31,18 +30,18 @@
           <w14:ligatures w14:val="standardContextual"/>
         </w:rPr>
         <w:drawing>
-          <wp:anchor distT="0" distB="0" distL="114300" distR="114300" simplePos="0" relativeHeight="251658240" behindDoc="0" locked="0" layoutInCell="1" allowOverlap="1" wp14:anchorId="01FCA65A" wp14:editId="6C060954">
+          <wp:anchor distT="0" distB="0" distL="114300" distR="114300" simplePos="0" relativeHeight="251658240" behindDoc="1" locked="0" layoutInCell="1" allowOverlap="1" wp14:anchorId="00A8EE55" wp14:editId="7BE3CEDB">
             <wp:simplePos x="0" y="0"/>
-            <wp:positionH relativeFrom="margin">
-              <wp:align>center</wp:align>
+            <wp:positionH relativeFrom="column">
+              <wp:posOffset>2171700</wp:posOffset>
             </wp:positionH>
             <wp:positionV relativeFrom="paragraph">
-              <wp:posOffset>-285115</wp:posOffset>
+              <wp:posOffset>230505</wp:posOffset>
             </wp:positionV>
-            <wp:extent cx="1941890" cy="1085215"/>
-            <wp:effectExtent l="0" t="0" r="1270" b="635"/>
-            <wp:wrapNone/>
-            <wp:docPr id="1882332052" name="Image 1" descr="Une image contenant texte, Police, Graphique, logo&#10;&#10;Description générée automatiquement"/>
+            <wp:extent cx="1526540" cy="1526540"/>
+            <wp:effectExtent l="0" t="0" r="0" b="0"/>
+            <wp:wrapTopAndBottom/>
+            <wp:docPr id="780628750" name="Graphique 2"/>
             <wp:cNvGraphicFramePr>
               <a:graphicFrameLocks xmlns:a="http://schemas.openxmlformats.org/drawingml/2006/main" noChangeAspect="1"/>
             </wp:cNvGraphicFramePr>
@@ -50,14 +49,14 @@
               <a:graphicData uri="http://schemas.openxmlformats.org/drawingml/2006/picture">
                 <pic:pic xmlns:pic="http://schemas.openxmlformats.org/drawingml/2006/picture">
                   <pic:nvPicPr>
-                    <pic:cNvPr id="1882332052" name="Image 1" descr="Une image contenant texte, Police, Graphique, logo&#10;&#10;Description générée automatiquement"/>
+                    <pic:cNvPr id="780628750" name="Graphique 780628750"/>
                     <pic:cNvPicPr/>
                   </pic:nvPicPr>
                   <pic:blipFill>
-                    <a:blip r:embed="rId4" cstate="print">
+                    <a:blip r:embed="rId4">
                       <a:extLst>
-                        <a:ext uri="{28A0092B-C50C-407E-A947-70E740481C1C}">
-                          <a14:useLocalDpi xmlns:a14="http://schemas.microsoft.com/office/drawing/2010/main" val="0"/>
+                        <a:ext uri="{96DAC541-7B7A-43D3-8B79-37D633B846F1}">
+                          <asvg:svgBlip xmlns:asvg="http://schemas.microsoft.com/office/drawing/2016/SVG/main" r:embed="rId5"/>
                         </a:ext>
                       </a:extLst>
                     </a:blip>
@@ -68,7 +67,7 @@
                   <pic:spPr>
                     <a:xfrm>
                       <a:off x="0" y="0"/>
-                      <a:ext cx="1941890" cy="1085215"/>
+                      <a:ext cx="1526540" cy="1526540"/>
                     </a:xfrm>
                     <a:prstGeom prst="rect">
                       <a:avLst/>
@@ -90,7 +89,6 @@
     <w:p>
       <w:pPr>
         <w:spacing w:after="0" w:line="240" w:lineRule="auto"/>
-        <w:jc w:val="center"/>
         <w:rPr>
           <w:rFonts w:ascii="Times New Roman" w:hAnsi="Times New Roman"/>
           <w:b/>
@@ -106,6 +104,36 @@
     <w:p>
       <w:pPr>
         <w:spacing w:after="0" w:line="240" w:lineRule="auto"/>
+        <w:jc w:val="center"/>
+        <w:rPr>
+          <w:rFonts w:ascii="Times New Roman" w:hAnsi="Times New Roman"/>
+          <w:b/>
+          <w:bCs/>
+          <w:color w:val="345E0A"/>
+          <w:sz w:val="40"/>
+          <w:szCs w:val="40"/>
+          <w:u w:val="double"/>
+          <w:lang w:val="fr-FR"/>
+        </w:rPr>
+      </w:pPr>
+      <w:r>
+        <w:rPr>
+          <w:rFonts w:ascii="Times New Roman" w:hAnsi="Times New Roman"/>
+          <w:b/>
+          <w:bCs/>
+          <w:color w:val="345E0A"/>
+          <w:sz w:val="40"/>
+          <w:szCs w:val="40"/>
+          <w:u w:val="double"/>
+          <w:lang w:val="fr-FR"/>
+        </w:rPr>
+        <w:t>ATTESTATION DE DOMICILIATION</w:t>
+      </w:r>
+    </w:p>
+    <w:p>
+      <w:pPr>
+        <w:spacing w:after="0" w:line="240" w:lineRule="auto"/>
+        <w:jc w:val="both"/>
         <w:rPr>
           <w:rFonts w:ascii="Times New Roman" w:hAnsi="Times New Roman"/>
           <w:b/>
@@ -121,6 +149,7 @@
     <w:p>
       <w:pPr>
         <w:spacing w:after="0" w:line="240" w:lineRule="auto"/>
+        <w:jc w:val="both"/>
         <w:rPr>
           <w:rFonts w:ascii="Times New Roman" w:hAnsi="Times New Roman"/>
           <w:b/>
@@ -135,153 +164,6 @@
     </w:p>
     <w:p>
       <w:pPr>
-        <w:spacing w:after="0" w:line="240" w:lineRule="auto"/>
-        <w:jc w:val="center"/>
-        <w:rPr>
-          <w:rFonts w:ascii="Times New Roman" w:hAnsi="Times New Roman"/>
-          <w:b/>
-          <w:bCs/>
-          <w:color w:val="7030A0"/>
-          <w:sz w:val="28"/>
-          <w:szCs w:val="28"/>
-          <w:u w:val="double"/>
-          <w:lang w:val="fr-FR"/>
-          <w14:textFill>
-            <w14:gradFill>
-              <w14:gsLst>
-                <w14:gs w14:pos="0">
-                  <w14:srgbClr w14:val="7030A0">
-                    <w14:shade w14:val="30000"/>
-                    <w14:satMod w14:val="115000"/>
-                  </w14:srgbClr>
-                </w14:gs>
-                <w14:gs w14:pos="50000">
-                  <w14:srgbClr w14:val="7030A0">
-                    <w14:shade w14:val="67500"/>
-                    <w14:satMod w14:val="115000"/>
-                  </w14:srgbClr>
-                </w14:gs>
-                <w14:gs w14:pos="100000">
-                  <w14:srgbClr w14:val="7030A0">
-                    <w14:shade w14:val="100000"/>
-                    <w14:satMod w14:val="115000"/>
-                  </w14:srgbClr>
-                </w14:gs>
-              </w14:gsLst>
-              <w14:path w14:path="circle">
-                <w14:fillToRect w14:l="50000" w14:t="50000" w14:r="50000" w14:b="50000"/>
-              </w14:path>
-            </w14:gradFill>
-          </w14:textFill>
-        </w:rPr>
-      </w:pPr>
-      <w:r>
-        <w:rPr>
-          <w:rFonts w:ascii="Times New Roman" w:hAnsi="Times New Roman"/>
-          <w:b/>
-          <w:bCs/>
-          <w:color w:val="7030A0"/>
-          <w:sz w:val="28"/>
-          <w:szCs w:val="28"/>
-          <w:u w:val="double"/>
-          <w:lang w:val="fr-FR"/>
-          <w14:textFill>
-            <w14:gradFill>
-              <w14:gsLst>
-                <w14:gs w14:pos="0">
-                  <w14:srgbClr w14:val="7030A0">
-                    <w14:shade w14:val="30000"/>
-                    <w14:satMod w14:val="115000"/>
-                  </w14:srgbClr>
-                </w14:gs>
-                <w14:gs w14:pos="50000">
-                  <w14:srgbClr w14:val="7030A0">
-                    <w14:shade w14:val="67500"/>
-                    <w14:satMod w14:val="115000"/>
-                  </w14:srgbClr>
-                </w14:gs>
-                <w14:gs w14:pos="100000">
-                  <w14:srgbClr w14:val="7030A0">
-                    <w14:shade w14:val="100000"/>
-                    <w14:satMod w14:val="115000"/>
-                  </w14:srgbClr>
-                </w14:gs>
-              </w14:gsLst>
-              <w14:path w14:path="circle">
-                <w14:fillToRect w14:l="50000" w14:t="50000" w14:r="50000" w14:b="50000"/>
-              </w14:path>
-            </w14:gradFill>
-          </w14:textFill>
-        </w:rPr>
-        <w:t>ATTESTATION DE DOMICILIATION</w:t>
-      </w:r>
-    </w:p>
-    <w:p>
-      <w:pPr>
-        <w:spacing w:after="0" w:line="240" w:lineRule="auto"/>
-        <w:jc w:val="both"/>
-        <w:rPr>
-          <w:rFonts w:ascii="Times New Roman" w:hAnsi="Times New Roman"/>
-          <w:b/>
-          <w:bCs/>
-          <w:color w:val="000000"/>
-          <w:sz w:val="28"/>
-          <w:szCs w:val="28"/>
-          <w:u w:val="double"/>
-          <w:lang w:val="fr-FR"/>
-        </w:rPr>
-      </w:pPr>
-    </w:p>
-    <w:p>
-      <w:pPr>
-        <w:spacing w:after="0" w:line="240" w:lineRule="auto"/>
-        <w:jc w:val="both"/>
-        <w:rPr>
-          <w:rFonts w:ascii="Times New Roman" w:hAnsi="Times New Roman"/>
-          <w:b/>
-          <w:bCs/>
-          <w:color w:val="000000"/>
-          <w:sz w:val="28"/>
-          <w:szCs w:val="28"/>
-          <w:u w:val="double"/>
-          <w:lang w:val="fr-FR"/>
-        </w:rPr>
-      </w:pPr>
-    </w:p>
-    <w:p>
-      <w:pPr>
-        <w:spacing w:after="0" w:line="240" w:lineRule="auto"/>
-        <w:jc w:val="both"/>
-        <w:rPr>
-          <w:rFonts w:ascii="Times New Roman" w:hAnsi="Times New Roman"/>
-          <w:b/>
-          <w:bCs/>
-          <w:color w:val="000000"/>
-          <w:sz w:val="28"/>
-          <w:szCs w:val="28"/>
-          <w:u w:val="double"/>
-          <w:lang w:val="fr-FR"/>
-        </w:rPr>
-      </w:pPr>
-    </w:p>
-    <w:p>
-      <w:pPr>
-        <w:spacing w:after="0" w:line="240" w:lineRule="auto"/>
-        <w:jc w:val="both"/>
-        <w:rPr>
-          <w:rFonts w:ascii="Times New Roman" w:hAnsi="Times New Roman"/>
-          <w:b/>
-          <w:bCs/>
-          <w:color w:val="000000"/>
-          <w:sz w:val="28"/>
-          <w:szCs w:val="28"/>
-          <w:u w:val="double"/>
-          <w:lang w:val="fr-FR"/>
-        </w:rPr>
-      </w:pPr>
-    </w:p>
-    <w:p>
-      <w:pPr>
         <w:spacing w:line="240" w:lineRule="auto"/>
         <w:ind w:firstLine="720"/>
         <w:jc w:val="both"/>
@@ -321,7 +203,29 @@
           <w:szCs w:val="24"/>
           <w:lang w:val="fr-FR"/>
         </w:rPr>
-        <w:t>LEMEDAJ</w:t>
+        <w:t>CENTIR</w:t>
+      </w:r>
+      <w:r>
+        <w:rPr>
+          <w:rFonts w:ascii="Times New Roman" w:hAnsi="Times New Roman"/>
+          <w:b/>
+          <w:bCs/>
+          <w:sz w:val="24"/>
+          <w:szCs w:val="24"/>
+          <w:lang w:val="fr-FR"/>
+        </w:rPr>
+        <w:t>I</w:t>
+      </w:r>
+      <w:r>
+        <w:rPr>
+          <w:rFonts w:ascii="Times New Roman" w:hAnsi="Times New Roman"/>
+          <w:b/>
+          <w:bCs/>
+          <w:sz w:val="24"/>
+          <w:szCs w:val="24"/>
+          <w:lang w:val="fr-FR"/>
+        </w:rPr>
+        <w:t>O</w:t>
       </w:r>
       <w:r>
         <w:rPr>
@@ -359,16 +263,16 @@
           <w:szCs w:val="24"/>
           <w:lang w:val="fr-FR"/>
         </w:rPr>
-        <w:t>ANGLE BD ZERKTOUNI ET RUE IBN AL MOUALIM N° 4, ETAGE 2, APPT N°10</w:t>
-      </w:r>
-      <w:r>
-        <w:rPr>
-          <w:rFonts w:ascii="Times New Roman" w:hAnsi="Times New Roman"/>
-          <w:sz w:val="24"/>
-          <w:szCs w:val="24"/>
-          <w:lang w:val="fr-FR"/>
-        </w:rPr>
-        <w:t>, CASABLANCA-MAROC</w:t>
+        <w:t xml:space="preserve">HAY MOULAY ABDELLAH RUE 300 N 152 ETG 2 AIN CHOCK, CASABLANCA </w:t>
+      </w:r>
+      <w:r>
+        <w:rPr>
+          <w:rFonts w:ascii="Times New Roman" w:hAnsi="Times New Roman"/>
+          <w:sz w:val="24"/>
+          <w:szCs w:val="24"/>
+          <w:lang w:val="fr-FR"/>
+        </w:rPr>
+        <w:t>-MAROC</w:t>
       </w:r>
     </w:p>
     <w:p>
@@ -379,11 +283,47 @@
           <w:rFonts w:ascii="Times New Roman" w:hAnsi="Times New Roman"/>
           <w:b/>
           <w:bCs/>
-          <w:sz w:val="24"/>
-          <w:szCs w:val="24"/>
-          <w:lang w:val="fr-FR"/>
-        </w:rPr>
-      </w:pPr>
+          <w:color w:val="385623" w:themeColor="accent6" w:themeShade="80"/>
+          <w:sz w:val="24"/>
+          <w:szCs w:val="24"/>
+          <w:lang w:val="fr-FR"/>
+        </w:rPr>
+      </w:pPr>
+      <w:r>
+        <w:rPr>
+          <w:rFonts w:ascii="Times New Roman" w:hAnsi="Times New Roman"/>
+          <w:b/>
+          <w:bCs/>
+          <w:sz w:val="24"/>
+          <w:szCs w:val="24"/>
+          <w:lang w:val="fr-FR"/>
+        </w:rPr>
+        <w:t xml:space="preserve">ICE : </w:t>
+      </w:r>
+      <w:r>
+        <w:rPr>
+          <w:rFonts w:ascii="Times New Roman" w:hAnsi="Times New Roman"/>
+          <w:b/>
+          <w:bCs/>
+          <w:color w:val="385623" w:themeColor="accent6" w:themeShade="80"/>
+          <w:sz w:val="24"/>
+          <w:szCs w:val="24"/>
+          <w:lang w:val="fr-FR"/>
+        </w:rPr>
+        <w:t>003829326000013</w:t>
+      </w:r>
+      <w:r>
+        <w:rPr>
+          <w:rFonts w:ascii="Times New Roman" w:hAnsi="Times New Roman"/>
+          <w:b/>
+          <w:bCs/>
+          <w:color w:val="385623" w:themeColor="accent6" w:themeShade="80"/>
+          <w:sz w:val="24"/>
+          <w:szCs w:val="24"/>
+          <w:lang w:val="fr-FR"/>
+        </w:rPr>
+        <w:t xml:space="preserve">     </w:t>
+      </w:r>
       <w:r>
         <w:rPr>
           <w:rFonts w:ascii="Times New Roman" w:hAnsi="Times New Roman"/>
@@ -404,17 +344,6 @@
           <w:szCs w:val="24"/>
           <w:lang w:val="fr-FR"/>
         </w:rPr>
-        <w:t xml:space="preserve"> 35654499</w:t>
-      </w:r>
-      <w:r>
-        <w:rPr>
-          <w:rFonts w:ascii="Times New Roman" w:hAnsi="Times New Roman"/>
-          <w:b/>
-          <w:bCs/>
-          <w:sz w:val="24"/>
-          <w:szCs w:val="24"/>
-          <w:lang w:val="fr-FR"/>
-        </w:rPr>
         <w:t xml:space="preserve"> </w:t>
       </w:r>
       <w:r>
@@ -422,11 +351,24 @@
           <w:rFonts w:ascii="Times New Roman" w:hAnsi="Times New Roman"/>
           <w:b/>
           <w:bCs/>
-          <w:sz w:val="24"/>
-          <w:szCs w:val="24"/>
-          <w:lang w:val="fr-FR"/>
-        </w:rPr>
-        <w:t xml:space="preserve">       </w:t>
+          <w:color w:val="385623" w:themeColor="accent6" w:themeShade="80"/>
+          <w:sz w:val="24"/>
+          <w:szCs w:val="24"/>
+          <w:lang w:val="fr-FR"/>
+        </w:rPr>
+        <w:t>34011285</w:t>
+      </w:r>
+      <w:r>
+        <w:rPr>
+          <w:rFonts w:ascii="Times New Roman" w:hAnsi="Times New Roman"/>
+          <w:b/>
+          <w:bCs/>
+          <w:color w:val="385623" w:themeColor="accent6" w:themeShade="80"/>
+          <w:sz w:val="24"/>
+          <w:szCs w:val="24"/>
+          <w:lang w:val="fr-FR"/>
+        </w:rPr>
+        <w:t xml:space="preserve">    </w:t>
       </w:r>
       <w:r>
         <w:rPr>
@@ -444,17 +386,19 @@
           <w:rFonts w:ascii="Times New Roman" w:hAnsi="Times New Roman"/>
           <w:b/>
           <w:bCs/>
-          <w:sz w:val="24"/>
-          <w:szCs w:val="24"/>
-          <w:lang w:val="fr-FR"/>
-        </w:rPr>
-        <w:t>53908795</w:t>
-      </w:r>
-      <w:r>
-        <w:rPr>
-          <w:rFonts w:ascii="Times New Roman" w:hAnsi="Times New Roman"/>
-          <w:b/>
-          <w:bCs/>
+          <w:color w:val="385623" w:themeColor="accent6" w:themeShade="80"/>
+          <w:sz w:val="24"/>
+          <w:szCs w:val="24"/>
+          <w:lang w:val="fr-FR"/>
+        </w:rPr>
+        <w:t>68834734</w:t>
+      </w:r>
+      <w:r>
+        <w:rPr>
+          <w:rFonts w:ascii="Times New Roman" w:hAnsi="Times New Roman"/>
+          <w:b/>
+          <w:bCs/>
+          <w:color w:val="385623" w:themeColor="accent6" w:themeShade="80"/>
           <w:sz w:val="24"/>
           <w:szCs w:val="24"/>
           <w:lang w:val="fr-FR"/>
@@ -466,6 +410,7 @@
           <w:rFonts w:ascii="Times New Roman" w:hAnsi="Times New Roman"/>
           <w:b/>
           <w:bCs/>
+          <w:color w:val="385623" w:themeColor="accent6" w:themeShade="80"/>
           <w:sz w:val="24"/>
           <w:szCs w:val="24"/>
           <w:lang w:val="fr-FR"/>
@@ -477,44 +422,35 @@
           <w:rFonts w:ascii="Times New Roman" w:hAnsi="Times New Roman"/>
           <w:b/>
           <w:bCs/>
-          <w:sz w:val="24"/>
-          <w:szCs w:val="24"/>
-          <w:lang w:val="fr-FR"/>
-        </w:rPr>
-        <w:t xml:space="preserve"> RC : </w:t>
-      </w:r>
-      <w:r>
-        <w:rPr>
-          <w:rFonts w:ascii="Times New Roman" w:hAnsi="Times New Roman"/>
-          <w:b/>
-          <w:bCs/>
-          <w:sz w:val="24"/>
-          <w:szCs w:val="24"/>
-          <w:lang w:val="fr-FR"/>
-        </w:rPr>
-        <w:t xml:space="preserve">593279          </w:t>
-      </w:r>
-      <w:r>
-        <w:rPr>
-          <w:rFonts w:ascii="Times New Roman" w:hAnsi="Times New Roman"/>
-          <w:b/>
-          <w:bCs/>
-          <w:sz w:val="24"/>
-          <w:szCs w:val="24"/>
-          <w:lang w:val="fr-FR"/>
-        </w:rPr>
-        <w:t xml:space="preserve">ICE : </w:t>
-      </w:r>
-      <w:r>
-        <w:rPr>
-          <w:rFonts w:ascii="Times New Roman" w:hAnsi="Times New Roman"/>
-          <w:b/>
-          <w:bCs/>
-          <w:sz w:val="24"/>
-          <w:szCs w:val="24"/>
-          <w:lang w:val="fr-FR"/>
-        </w:rPr>
-        <w:t>003338405000024</w:t>
+          <w:color w:val="385623" w:themeColor="accent6" w:themeShade="80"/>
+          <w:sz w:val="24"/>
+          <w:szCs w:val="24"/>
+          <w:lang w:val="fr-FR"/>
+        </w:rPr>
+        <w:t xml:space="preserve"> </w:t>
+      </w:r>
+      <w:r>
+        <w:rPr>
+          <w:rFonts w:ascii="Times New Roman" w:hAnsi="Times New Roman"/>
+          <w:b/>
+          <w:bCs/>
+          <w:sz w:val="24"/>
+          <w:szCs w:val="24"/>
+          <w:lang w:val="fr-FR"/>
+        </w:rPr>
+        <w:t xml:space="preserve">RC : </w:t>
+      </w:r>
+      <w:r>
+        <w:rPr>
+          <w:rFonts w:ascii="Times New Roman" w:hAnsi="Times New Roman"/>
+          <w:b/>
+          <w:bCs/>
+          <w:color w:val="385623" w:themeColor="accent6" w:themeShade="80"/>
+          <w:sz w:val="24"/>
+          <w:szCs w:val="24"/>
+          <w:lang w:val="fr-FR"/>
+        </w:rPr>
+        <w:t>705161</w:t>
       </w:r>
     </w:p>
     <w:p>
@@ -543,7 +479,7 @@
           <w:rFonts w:ascii="Times New Roman" w:hAnsi="Times New Roman"/>
           <w:b/>
           <w:bCs/>
-          <w:color w:val="7030A0"/>
+          <w:color w:val="385623" w:themeColor="accent6" w:themeShade="80"/>
           <w:sz w:val="28"/>
           <w:szCs w:val="28"/>
           <w:lang w:val="fr-FR"/>
@@ -565,7 +501,7 @@
         <w:rPr>
           <w:rFonts w:ascii="Times New Roman" w:hAnsi="Times New Roman"/>
           <w:b/>
-          <w:color w:val="7030A0"/>
+          <w:color w:val="385623" w:themeColor="accent6" w:themeShade="80"/>
           <w:sz w:val="24"/>
           <w:szCs w:val="24"/>
           <w:lang w:val="fr-FR"/>
@@ -603,6 +539,45 @@
           <w:rFonts w:ascii="Times New Roman" w:hAnsi="Times New Roman"/>
           <w:b/>
           <w:bCs/>
+          <w:color w:val="385623" w:themeColor="accent6" w:themeShade="80"/>
+          <w:sz w:val="32"/>
+          <w:szCs w:val="32"/>
+          <w:lang w:val="fr-FR"/>
+        </w:rPr>
+      </w:pPr>
+      <w:r>
+        <w:rPr>
+          <w:rFonts w:ascii="Times New Roman" w:hAnsi="Times New Roman"/>
+          <w:b/>
+          <w:bCs/>
+          <w:color w:val="385623" w:themeColor="accent6" w:themeShade="80"/>
+          <w:sz w:val="32"/>
+          <w:szCs w:val="32"/>
+          <w:lang w:val="fr-FR"/>
+        </w:rPr>
+        <w:t>ANGLE BD ZERKTOUNI ET RUE IBN AL MOUALIM N° 4, ETAGE 2, APPT N°10, CASABLANCA</w:t>
+      </w:r>
+      <w:r>
+        <w:rPr>
+          <w:rFonts w:ascii="Times New Roman" w:hAnsi="Times New Roman"/>
+          <w:b/>
+          <w:bCs/>
+          <w:color w:val="385623" w:themeColor="accent6" w:themeShade="80"/>
+          <w:sz w:val="32"/>
+          <w:szCs w:val="32"/>
+          <w:lang w:val="fr-FR"/>
+        </w:rPr>
+        <w:t>.</w:t>
+      </w:r>
+    </w:p>
+    <w:p>
+      <w:pPr>
+        <w:spacing w:line="240" w:lineRule="auto"/>
+        <w:jc w:val="center"/>
+        <w:rPr>
+          <w:rFonts w:ascii="Times New Roman" w:hAnsi="Times New Roman"/>
+          <w:b/>
+          <w:bCs/>
           <w:color w:val="7030A0"/>
           <w:sz w:val="32"/>
           <w:szCs w:val="32"/>
@@ -614,62 +589,58 @@
           <w:rFonts w:ascii="Times New Roman" w:hAnsi="Times New Roman"/>
           <w:b/>
           <w:bCs/>
-          <w:color w:val="7030A0"/>
           <w:sz w:val="32"/>
           <w:szCs w:val="32"/>
           <w:lang w:val="fr-FR"/>
         </w:rPr>
-        <w:t>ANGLE BD ZERKTOUNI ET RUE IBN AL MOUALIM N° 4, ETAGE 2, APPT N°10, CASABLANCA</w:t>
-      </w:r>
-      <w:r>
-        <w:rPr>
-          <w:rFonts w:ascii="Times New Roman" w:hAnsi="Times New Roman"/>
-          <w:b/>
-          <w:bCs/>
-          <w:color w:val="7030A0"/>
+        <w:t xml:space="preserve">Pour une durée de : </w:t>
+      </w:r>
+      <w:r>
+        <w:rPr>
+          <w:rFonts w:ascii="Times New Roman" w:hAnsi="Times New Roman"/>
+          <w:b/>
+          <w:bCs/>
+          <w:color w:val="385623" w:themeColor="accent6" w:themeShade="80"/>
           <w:sz w:val="32"/>
           <w:szCs w:val="32"/>
           <w:lang w:val="fr-FR"/>
         </w:rPr>
-        <w:t>.</w:t>
-      </w:r>
-    </w:p>
-    <w:p>
-      <w:pPr>
-        <w:spacing w:line="240" w:lineRule="auto"/>
-        <w:jc w:val="center"/>
-        <w:rPr>
-          <w:rFonts w:ascii="Times New Roman" w:hAnsi="Times New Roman"/>
-          <w:b/>
-          <w:bCs/>
-          <w:color w:val="7030A0"/>
+        <w:t xml:space="preserve">{{PERIOD_DOMCIL}} </w:t>
+      </w:r>
+      <w:r>
+        <w:rPr>
+          <w:rFonts w:ascii="Times New Roman" w:hAnsi="Times New Roman"/>
+          <w:b/>
+          <w:bCs/>
           <w:sz w:val="32"/>
           <w:szCs w:val="32"/>
           <w:lang w:val="fr-FR"/>
         </w:rPr>
-      </w:pPr>
-      <w:r>
-        <w:rPr>
-          <w:rFonts w:ascii="Times New Roman" w:hAnsi="Times New Roman"/>
-          <w:b/>
-          <w:bCs/>
+        <w:t xml:space="preserve">Mois du </w:t>
+      </w:r>
+      <w:r>
+        <w:rPr>
+          <w:rFonts w:ascii="Times New Roman" w:hAnsi="Times New Roman"/>
+          <w:b/>
+          <w:bCs/>
+          <w:color w:val="385623" w:themeColor="accent6" w:themeShade="80"/>
           <w:sz w:val="32"/>
           <w:szCs w:val="32"/>
           <w:lang w:val="fr-FR"/>
         </w:rPr>
-        <w:t xml:space="preserve">Pour une durée de : </w:t>
-      </w:r>
-      <w:r>
-        <w:rPr>
-          <w:rFonts w:ascii="Times New Roman" w:hAnsi="Times New Roman"/>
-          <w:b/>
-          <w:bCs/>
-          <w:color w:val="7030A0"/>
+        <w:t>{{DOM_DATEDEB}}</w:t>
+      </w:r>
+      <w:r>
+        <w:rPr>
+          <w:rFonts w:ascii="Times New Roman" w:hAnsi="Times New Roman"/>
+          <w:b/>
+          <w:bCs/>
+          <w:color w:val="385623" w:themeColor="accent6" w:themeShade="80"/>
           <w:sz w:val="32"/>
           <w:szCs w:val="32"/>
           <w:lang w:val="fr-FR"/>
         </w:rPr>
-        <w:t xml:space="preserve">{{PERIOD_DOMCIL}} </w:t>
+        <w:t xml:space="preserve"> </w:t>
       </w:r>
       <w:r>
         <w:rPr>
@@ -680,37 +651,14 @@
           <w:szCs w:val="32"/>
           <w:lang w:val="fr-FR"/>
         </w:rPr>
-        <w:t xml:space="preserve">Mois du </w:t>
-      </w:r>
-      <w:r>
-        <w:rPr>
-          <w:rFonts w:ascii="Times New Roman" w:hAnsi="Times New Roman"/>
-          <w:b/>
-          <w:bCs/>
-          <w:color w:val="7030A0"/>
-          <w:sz w:val="32"/>
-          <w:szCs w:val="32"/>
-          <w:lang w:val="fr-FR"/>
-        </w:rPr>
-        <w:t>{{DOM_DATEDEB}}</w:t>
-      </w:r>
-      <w:r>
-        <w:rPr>
-          <w:rFonts w:ascii="Times New Roman" w:hAnsi="Times New Roman"/>
-          <w:b/>
-          <w:bCs/>
-          <w:sz w:val="32"/>
-          <w:szCs w:val="32"/>
-          <w:lang w:val="fr-FR"/>
-        </w:rPr>
-        <w:t xml:space="preserve"> au </w:t>
-      </w:r>
-      <w:r>
-        <w:rPr>
-          <w:rFonts w:ascii="Times New Roman" w:hAnsi="Times New Roman"/>
-          <w:b/>
-          <w:bCs/>
-          <w:color w:val="7030A0"/>
+        <w:t xml:space="preserve">au </w:t>
+      </w:r>
+      <w:r>
+        <w:rPr>
+          <w:rFonts w:ascii="Times New Roman" w:hAnsi="Times New Roman"/>
+          <w:b/>
+          <w:bCs/>
+          <w:color w:val="385623" w:themeColor="accent6" w:themeShade="80"/>
           <w:sz w:val="32"/>
           <w:szCs w:val="32"/>
           <w:lang w:val="fr-FR"/>
@@ -1283,13 +1231,13 @@
       <w14:ligatures w14:val="none"/>
     </w:rPr>
   </w:style>
-  <w:style w:type="character" w:default="1" w:styleId="DefaultParagraphFont">
+  <w:style w:type="character" w:default="1" w:styleId="Policepardfaut">
     <w:name w:val="Default Paragraph Font"/>
     <w:uiPriority w:val="1"/>
     <w:semiHidden/>
     <w:unhideWhenUsed/>
   </w:style>
-  <w:style w:type="table" w:default="1" w:styleId="TableNormal">
+  <w:style w:type="table" w:default="1" w:styleId="TableauNormal">
     <w:name w:val="Normal Table"/>
     <w:uiPriority w:val="99"/>
     <w:semiHidden/>
@@ -1304,7 +1252,7 @@
       </w:tblCellMar>
     </w:tblPr>
   </w:style>
-  <w:style w:type="numbering" w:default="1" w:styleId="NoList">
+  <w:style w:type="numbering" w:default="1" w:styleId="Aucuneliste">
     <w:name w:val="No List"/>
     <w:uiPriority w:val="99"/>
     <w:semiHidden/>

</xml_diff>